<commit_message>
Also Fix Document for fix
</commit_message>
<xml_diff>
--- a/Practicals/OS_Practical-2.docx
+++ b/Practicals/OS_Practical-2.docx
@@ -147,17 +147,7 @@
                 <w:sz w:val="32"/>
                 <w:szCs w:val="32"/>
               </w:rPr>
-              <w:t xml:space="preserve"> </w:t>
-            </w:r>
-            <w:proofErr w:type="gramStart"/>
-            <w:r>
-              <w:rPr>
-                <w:rFonts w:ascii="Times New Roman" w:hAnsi="Times New Roman"/>
-                <w:b/>
-                <w:sz w:val="32"/>
-                <w:szCs w:val="32"/>
-              </w:rPr>
-              <w:t>System</w:t>
+              <w:t xml:space="preserve"> System</w:t>
             </w:r>
             <w:r>
               <w:rPr>
@@ -191,7 +181,6 @@
               </w:rPr>
               <w:t>]</w:t>
             </w:r>
-            <w:proofErr w:type="gramEnd"/>
           </w:p>
         </w:tc>
       </w:tr>
@@ -1666,18 +1655,8 @@
                 <w:sz w:val="24"/>
                 <w:szCs w:val="24"/>
               </w:rPr>
-              <w:t xml:space="preserve">Move to previous </w:t>
+              <w:t>Move to previous word</w:t>
             </w:r>
-            <w:proofErr w:type="gramStart"/>
-            <w:r>
-              <w:rPr>
-                <w:rFonts w:ascii="Times New Roman" w:hAnsi="Times New Roman"/>
-                <w:sz w:val="24"/>
-                <w:szCs w:val="24"/>
-              </w:rPr>
-              <w:t>word</w:t>
-            </w:r>
-            <w:proofErr w:type="gramEnd"/>
           </w:p>
         </w:tc>
       </w:tr>
@@ -2090,7 +2069,6 @@
                 <w:lang w:val="en-IN"/>
               </w:rPr>
             </w:pPr>
-            <w:proofErr w:type="spellStart"/>
             <w:r>
               <w:rPr>
                 <w:rStyle w:val="HTMLCode"/>
@@ -2100,7 +2078,6 @@
               </w:rPr>
               <w:t>i</w:t>
             </w:r>
-            <w:proofErr w:type="spellEnd"/>
           </w:p>
         </w:tc>
         <w:tc>
@@ -2589,27 +2566,7 @@
           <w:szCs w:val="24"/>
           <w:lang w:val="en-IN"/>
         </w:rPr>
-        <w:t xml:space="preserve">Entered by </w:t>
-      </w:r>
-      <w:proofErr w:type="gramStart"/>
-      <w:r>
-        <w:rPr>
-          <w:rFonts w:ascii="Times New Roman" w:hAnsi="Times New Roman"/>
-          <w:sz w:val="24"/>
-          <w:szCs w:val="24"/>
-          <w:lang w:val="en-IN"/>
-        </w:rPr>
-        <w:t>pressing :</w:t>
-      </w:r>
-      <w:proofErr w:type="gramEnd"/>
-      <w:r>
-        <w:rPr>
-          <w:rFonts w:ascii="Times New Roman" w:hAnsi="Times New Roman"/>
-          <w:sz w:val="24"/>
-          <w:szCs w:val="24"/>
-          <w:lang w:val="en-IN"/>
-        </w:rPr>
-        <w:t xml:space="preserve"> in command mode.</w:t>
+        <w:t>Entered by pressing : in command mode.</w:t>
       </w:r>
     </w:p>
     <w:p>
@@ -2708,7 +2665,6 @@
                 <w:lang w:val="en-IN"/>
               </w:rPr>
             </w:pPr>
-            <w:proofErr w:type="gramStart"/>
             <w:r>
               <w:rPr>
                 <w:rStyle w:val="HTMLCode"/>
@@ -2718,7 +2674,6 @@
               </w:rPr>
               <w:t>:w</w:t>
             </w:r>
-            <w:proofErr w:type="gramEnd"/>
           </w:p>
         </w:tc>
         <w:tc>
@@ -2765,7 +2720,6 @@
                 <w:lang w:val="en-IN"/>
               </w:rPr>
             </w:pPr>
-            <w:proofErr w:type="gramStart"/>
             <w:r>
               <w:rPr>
                 <w:rStyle w:val="HTMLCode"/>
@@ -2775,7 +2729,6 @@
               </w:rPr>
               <w:t>:q</w:t>
             </w:r>
-            <w:proofErr w:type="gramEnd"/>
           </w:p>
         </w:tc>
         <w:tc>
@@ -2822,7 +2775,6 @@
                 <w:lang w:val="en-IN"/>
               </w:rPr>
             </w:pPr>
-            <w:proofErr w:type="gramStart"/>
             <w:r>
               <w:rPr>
                 <w:rStyle w:val="HTMLCode"/>
@@ -2830,20 +2782,8 @@
                 <w:sz w:val="24"/>
                 <w:szCs w:val="24"/>
               </w:rPr>
-              <w:t>:</w:t>
+              <w:t>:wq</w:t>
             </w:r>
-            <w:proofErr w:type="spellStart"/>
-            <w:r>
-              <w:rPr>
-                <w:rStyle w:val="HTMLCode"/>
-                <w:rFonts w:ascii="Times New Roman" w:eastAsia="Calibri" w:hAnsi="Times New Roman" w:cs="Times New Roman"/>
-                <w:sz w:val="24"/>
-                <w:szCs w:val="24"/>
-              </w:rPr>
-              <w:t>wq</w:t>
-            </w:r>
-            <w:proofErr w:type="spellEnd"/>
-            <w:proofErr w:type="gramEnd"/>
           </w:p>
         </w:tc>
         <w:tc>
@@ -2890,7 +2830,6 @@
                 <w:lang w:val="en-IN"/>
               </w:rPr>
             </w:pPr>
-            <w:proofErr w:type="gramStart"/>
             <w:r>
               <w:rPr>
                 <w:rStyle w:val="HTMLCode"/>
@@ -2898,17 +2837,7 @@
                 <w:sz w:val="24"/>
                 <w:szCs w:val="24"/>
               </w:rPr>
-              <w:t>:q</w:t>
-            </w:r>
-            <w:proofErr w:type="gramEnd"/>
-            <w:r>
-              <w:rPr>
-                <w:rStyle w:val="HTMLCode"/>
-                <w:rFonts w:ascii="Times New Roman" w:eastAsia="Calibri" w:hAnsi="Times New Roman" w:cs="Times New Roman"/>
-                <w:sz w:val="24"/>
-                <w:szCs w:val="24"/>
-              </w:rPr>
-              <w:t>!</w:t>
+              <w:t>:q!</w:t>
             </w:r>
           </w:p>
         </w:tc>
@@ -2956,7 +2885,6 @@
                 <w:lang w:val="en-IN"/>
               </w:rPr>
             </w:pPr>
-            <w:proofErr w:type="gramStart"/>
             <w:r>
               <w:rPr>
                 <w:rStyle w:val="HTMLCode"/>
@@ -2964,17 +2892,7 @@
                 <w:sz w:val="24"/>
                 <w:szCs w:val="24"/>
               </w:rPr>
-              <w:t>:set</w:t>
-            </w:r>
-            <w:proofErr w:type="gramEnd"/>
-            <w:r>
-              <w:rPr>
-                <w:rStyle w:val="HTMLCode"/>
-                <w:rFonts w:ascii="Times New Roman" w:eastAsia="Calibri" w:hAnsi="Times New Roman" w:cs="Times New Roman"/>
-                <w:sz w:val="24"/>
-                <w:szCs w:val="24"/>
-              </w:rPr>
-              <w:t xml:space="preserve"> number</w:t>
+              <w:t>:set number</w:t>
             </w:r>
           </w:p>
         </w:tc>
@@ -3297,7 +3215,6 @@
                 <w:lang w:val="en-IN"/>
               </w:rPr>
             </w:pPr>
-            <w:proofErr w:type="spellStart"/>
             <w:r>
               <w:rPr>
                 <w:rStyle w:val="HTMLCode"/>
@@ -3307,7 +3224,6 @@
               </w:rPr>
               <w:t>dw</w:t>
             </w:r>
-            <w:proofErr w:type="spellEnd"/>
           </w:p>
         </w:tc>
         <w:tc>
@@ -3566,7 +3482,6 @@
                 <w:lang w:val="en-IN"/>
               </w:rPr>
             </w:pPr>
-            <w:proofErr w:type="spellStart"/>
             <w:r>
               <w:rPr>
                 <w:rStyle w:val="HTMLCode"/>
@@ -3576,7 +3491,6 @@
               </w:rPr>
               <w:t>yy</w:t>
             </w:r>
-            <w:proofErr w:type="spellEnd"/>
           </w:p>
         </w:tc>
         <w:tc>
@@ -3623,7 +3537,6 @@
                 <w:lang w:val="en-IN"/>
               </w:rPr>
             </w:pPr>
-            <w:proofErr w:type="spellStart"/>
             <w:r>
               <w:rPr>
                 <w:rStyle w:val="HTMLCode"/>
@@ -3633,7 +3546,6 @@
               </w:rPr>
               <w:t>yw</w:t>
             </w:r>
-            <w:proofErr w:type="spellEnd"/>
           </w:p>
         </w:tc>
         <w:tc>
@@ -4002,7 +3914,6 @@
                 <w:lang w:val="en-IN"/>
               </w:rPr>
             </w:pPr>
-            <w:proofErr w:type="spellStart"/>
             <w:r>
               <w:rPr>
                 <w:rStyle w:val="HTMLCode"/>
@@ -4012,7 +3923,6 @@
               </w:rPr>
               <w:t>cw</w:t>
             </w:r>
-            <w:proofErr w:type="spellEnd"/>
           </w:p>
         </w:tc>
         <w:tc>
@@ -4536,25 +4446,14 @@
           <w:lang w:val="en-IN"/>
         </w:rPr>
       </w:pPr>
-      <w:proofErr w:type="spellStart"/>
-      <w:r>
-        <w:rPr>
-          <w:rFonts w:ascii="Times New Roman" w:hAnsi="Times New Roman"/>
-          <w:sz w:val="24"/>
-          <w:szCs w:val="24"/>
-          <w:lang w:val="en-IN"/>
-        </w:rPr>
-        <w:t>stdout</w:t>
-      </w:r>
-      <w:proofErr w:type="spellEnd"/>
-      <w:r>
-        <w:rPr>
-          <w:rFonts w:ascii="Times New Roman" w:hAnsi="Times New Roman"/>
-          <w:sz w:val="24"/>
-          <w:szCs w:val="24"/>
-          <w:lang w:val="en-IN"/>
-        </w:rPr>
-        <w:t xml:space="preserve"> (1) → screen</w:t>
+      <w:r>
+        <w:rPr>
+          <w:rFonts w:ascii="Times New Roman" w:hAnsi="Times New Roman"/>
+          <w:sz w:val="24"/>
+          <w:szCs w:val="24"/>
+          <w:lang w:val="en-IN"/>
+        </w:rPr>
+        <w:t>stdout (1) → screen</w:t>
       </w:r>
     </w:p>
     <w:p>
@@ -4601,21 +4500,8 @@
           <w:szCs w:val="24"/>
           <w:lang w:val="en-IN"/>
         </w:rPr>
-        <w:t xml:space="preserve">Types of </w:t>
-      </w:r>
-      <w:proofErr w:type="gramStart"/>
-      <w:r>
-        <w:rPr>
-          <w:rFonts w:ascii="Times New Roman" w:hAnsi="Times New Roman"/>
-          <w:b/>
-          <w:bCs/>
-          <w:sz w:val="24"/>
-          <w:szCs w:val="24"/>
-          <w:lang w:val="en-IN"/>
-        </w:rPr>
-        <w:t>Redirection</w:t>
-      </w:r>
-      <w:proofErr w:type="gramEnd"/>
+        <w:t>Types of Redirection</w:t>
+      </w:r>
     </w:p>
     <w:p>
       <w:pPr>
@@ -4901,31 +4787,7 @@
           <w:szCs w:val="24"/>
           <w:lang w:val="en-IN"/>
         </w:rPr>
-        <w:t xml:space="preserve">ls </w:t>
-      </w:r>
-      <w:proofErr w:type="spellStart"/>
-      <w:r>
-        <w:rPr>
-          <w:rFonts w:ascii="Times New Roman" w:hAnsi="Times New Roman"/>
-          <w:i/>
-          <w:iCs/>
-          <w:sz w:val="24"/>
-          <w:szCs w:val="24"/>
-          <w:lang w:val="en-IN"/>
-        </w:rPr>
-        <w:t>xyz</w:t>
-      </w:r>
-      <w:proofErr w:type="spellEnd"/>
-      <w:r>
-        <w:rPr>
-          <w:rFonts w:ascii="Times New Roman" w:hAnsi="Times New Roman"/>
-          <w:i/>
-          <w:iCs/>
-          <w:sz w:val="24"/>
-          <w:szCs w:val="24"/>
-          <w:lang w:val="en-IN"/>
-        </w:rPr>
-        <w:t xml:space="preserve"> 2&gt; error.txt</w:t>
+        <w:t>ls xyz 2&gt; error.txt</w:t>
       </w:r>
       <w:r>
         <w:rPr>
@@ -5165,31 +5027,7 @@
           <w:szCs w:val="24"/>
           <w:lang w:val="en-IN"/>
         </w:rPr>
-        <w:t xml:space="preserve">ls | </w:t>
-      </w:r>
-      <w:proofErr w:type="spellStart"/>
-      <w:r>
-        <w:rPr>
-          <w:rFonts w:ascii="Times New Roman" w:hAnsi="Times New Roman"/>
-          <w:i/>
-          <w:iCs/>
-          <w:sz w:val="24"/>
-          <w:szCs w:val="24"/>
-          <w:lang w:val="en-IN"/>
-        </w:rPr>
-        <w:t>wc</w:t>
-      </w:r>
-      <w:proofErr w:type="spellEnd"/>
-      <w:r>
-        <w:rPr>
-          <w:rFonts w:ascii="Times New Roman" w:hAnsi="Times New Roman"/>
-          <w:i/>
-          <w:iCs/>
-          <w:sz w:val="24"/>
-          <w:szCs w:val="24"/>
-          <w:lang w:val="en-IN"/>
-        </w:rPr>
-        <w:t xml:space="preserve"> -l</w:t>
+        <w:t>ls | wc -l</w:t>
       </w:r>
     </w:p>
     <w:p>
@@ -5291,7 +5129,6 @@
           <w:lang w:val="en-IN"/>
         </w:rPr>
       </w:pPr>
-      <w:proofErr w:type="spellStart"/>
       <w:r>
         <w:rPr>
           <w:rFonts w:ascii="Times New Roman" w:hAnsi="Times New Roman"/>
@@ -5301,19 +5138,7 @@
           <w:szCs w:val="24"/>
           <w:lang w:val="en-IN"/>
         </w:rPr>
-        <w:t>ps</w:t>
-      </w:r>
-      <w:proofErr w:type="spellEnd"/>
-      <w:r>
-        <w:rPr>
-          <w:rFonts w:ascii="Times New Roman" w:hAnsi="Times New Roman"/>
-          <w:i/>
-          <w:iCs/>
-          <w:sz w:val="24"/>
-          <w:szCs w:val="24"/>
-          <w:lang w:val="en-IN"/>
-        </w:rPr>
-        <w:t xml:space="preserve"> aux | grep root</w:t>
+        <w:t>ps aux | grep root</w:t>
       </w:r>
     </w:p>
     <w:p>
@@ -5698,31 +5523,7 @@
           <w:szCs w:val="24"/>
           <w:lang w:val="en-IN"/>
         </w:rPr>
-        <w:t xml:space="preserve">files=$(ls | </w:t>
-      </w:r>
-      <w:proofErr w:type="spellStart"/>
-      <w:r>
-        <w:rPr>
-          <w:rFonts w:ascii="Times New Roman" w:hAnsi="Times New Roman"/>
-          <w:i/>
-          <w:iCs/>
-          <w:sz w:val="24"/>
-          <w:szCs w:val="24"/>
-          <w:lang w:val="en-IN"/>
-        </w:rPr>
-        <w:t>wc</w:t>
-      </w:r>
-      <w:proofErr w:type="spellEnd"/>
-      <w:r>
-        <w:rPr>
-          <w:rFonts w:ascii="Times New Roman" w:hAnsi="Times New Roman"/>
-          <w:i/>
-          <w:iCs/>
-          <w:sz w:val="24"/>
-          <w:szCs w:val="24"/>
-          <w:lang w:val="en-IN"/>
-        </w:rPr>
-        <w:t xml:space="preserve"> -l)</w:t>
+        <w:t>files=$(ls | wc -l)</w:t>
       </w:r>
     </w:p>
     <w:p>
@@ -6117,7 +5918,6 @@
           <w:lang w:val="en-IN"/>
         </w:rPr>
       </w:pPr>
-      <w:proofErr w:type="gramStart"/>
       <w:r>
         <w:rPr>
           <w:rFonts w:ascii="Times New Roman" w:hAnsi="Times New Roman"/>
@@ -6127,19 +5927,7 @@
           <w:szCs w:val="24"/>
           <w:lang w:val="en-IN"/>
         </w:rPr>
-        <w:t>#!/</w:t>
-      </w:r>
-      <w:proofErr w:type="gramEnd"/>
-      <w:r>
-        <w:rPr>
-          <w:rFonts w:ascii="Times New Roman" w:hAnsi="Times New Roman"/>
-          <w:i/>
-          <w:iCs/>
-          <w:sz w:val="24"/>
-          <w:szCs w:val="24"/>
-          <w:lang w:val="en-IN"/>
-        </w:rPr>
-        <w:t>bin/bash</w:t>
+        <w:t>#!/bin/bash</w:t>
       </w:r>
     </w:p>
     <w:p>
@@ -6202,7 +5990,6 @@
           <w:lang w:val="en-IN"/>
         </w:rPr>
       </w:pPr>
-      <w:proofErr w:type="gramStart"/>
       <w:r>
         <w:rPr>
           <w:rFonts w:ascii="Times New Roman" w:hAnsi="Times New Roman"/>
@@ -6211,18 +5998,7 @@
           <w:highlight w:val="darkGray"/>
           <w:lang w:val="en-IN"/>
         </w:rPr>
-        <w:t>#!/</w:t>
-      </w:r>
-      <w:proofErr w:type="gramEnd"/>
-      <w:r>
-        <w:rPr>
-          <w:rFonts w:ascii="Times New Roman" w:hAnsi="Times New Roman"/>
-          <w:sz w:val="24"/>
-          <w:szCs w:val="24"/>
-          <w:highlight w:val="darkGray"/>
-          <w:lang w:val="en-IN"/>
-        </w:rPr>
-        <w:t>bin/bash</w:t>
+        <w:t>#!/bin/bash</w:t>
       </w:r>
       <w:r>
         <w:rPr>
@@ -6735,7 +6511,6 @@
           <w:lang w:val="en-IN"/>
         </w:rPr>
       </w:pPr>
-      <w:proofErr w:type="gramStart"/>
       <w:r>
         <w:rPr>
           <w:rFonts w:ascii="Times New Roman" w:hAnsi="Times New Roman"/>
@@ -6745,10 +6520,11 @@
           <w:szCs w:val="24"/>
           <w:lang w:val="en-IN"/>
         </w:rPr>
-        <w:t>#!/</w:t>
-      </w:r>
-      <w:proofErr w:type="gramEnd"/>
-      <w:r>
+        <w:t>#!/bin/bash</w:t>
+      </w:r>
+    </w:p>
+    <w:p>
+      <w:pPr>
         <w:rPr>
           <w:rFonts w:ascii="Times New Roman" w:hAnsi="Times New Roman"/>
           <w:i/>
@@ -6757,11 +6533,8 @@
           <w:szCs w:val="24"/>
           <w:lang w:val="en-IN"/>
         </w:rPr>
-        <w:t>bin/bash</w:t>
-      </w:r>
-    </w:p>
-    <w:p>
-      <w:pPr>
+      </w:pPr>
+      <w:r>
         <w:rPr>
           <w:rFonts w:ascii="Times New Roman" w:hAnsi="Times New Roman"/>
           <w:i/>
@@ -6770,8 +6543,11 @@
           <w:szCs w:val="24"/>
           <w:lang w:val="en-IN"/>
         </w:rPr>
-      </w:pPr>
-      <w:r>
+        <w:t>read -p "Enter number: " n</w:t>
+      </w:r>
+    </w:p>
+    <w:p>
+      <w:pPr>
         <w:rPr>
           <w:rFonts w:ascii="Times New Roman" w:hAnsi="Times New Roman"/>
           <w:i/>
@@ -6780,11 +6556,8 @@
           <w:szCs w:val="24"/>
           <w:lang w:val="en-IN"/>
         </w:rPr>
-        <w:t>read -p "Enter number: " n</w:t>
-      </w:r>
-    </w:p>
-    <w:p>
-      <w:pPr>
+      </w:pPr>
+      <w:r>
         <w:rPr>
           <w:rFonts w:ascii="Times New Roman" w:hAnsi="Times New Roman"/>
           <w:i/>
@@ -6793,55 +6566,8 @@
           <w:szCs w:val="24"/>
           <w:lang w:val="en-IN"/>
         </w:rPr>
-      </w:pPr>
-      <w:r>
-        <w:rPr>
-          <w:rFonts w:ascii="Times New Roman" w:hAnsi="Times New Roman"/>
-          <w:i/>
-          <w:iCs/>
-          <w:sz w:val="24"/>
-          <w:szCs w:val="24"/>
-          <w:lang w:val="en-IN"/>
-        </w:rPr>
-        <w:t>if [ $n -</w:t>
-      </w:r>
-      <w:proofErr w:type="spellStart"/>
-      <w:r>
-        <w:rPr>
-          <w:rFonts w:ascii="Times New Roman" w:hAnsi="Times New Roman"/>
-          <w:i/>
-          <w:iCs/>
-          <w:sz w:val="24"/>
-          <w:szCs w:val="24"/>
-          <w:lang w:val="en-IN"/>
-        </w:rPr>
-        <w:t>gt</w:t>
-      </w:r>
-      <w:proofErr w:type="spellEnd"/>
-      <w:r>
-        <w:rPr>
-          <w:rFonts w:ascii="Times New Roman" w:hAnsi="Times New Roman"/>
-          <w:i/>
-          <w:iCs/>
-          <w:sz w:val="24"/>
-          <w:szCs w:val="24"/>
-          <w:lang w:val="en-IN"/>
-        </w:rPr>
-        <w:t xml:space="preserve"> </w:t>
-      </w:r>
-      <w:proofErr w:type="gramStart"/>
-      <w:r>
-        <w:rPr>
-          <w:rFonts w:ascii="Times New Roman" w:hAnsi="Times New Roman"/>
-          <w:i/>
-          <w:iCs/>
-          <w:sz w:val="24"/>
-          <w:szCs w:val="24"/>
-          <w:lang w:val="en-IN"/>
-        </w:rPr>
-        <w:t>0 ]</w:t>
-      </w:r>
-      <w:proofErr w:type="gramEnd"/>
+        <w:t>if [ $n -gt 0 ]</w:t>
+      </w:r>
     </w:p>
     <w:p>
       <w:pPr>
@@ -7252,57 +6978,26 @@
           <w:szCs w:val="24"/>
           <w:lang w:val="en-IN"/>
         </w:rPr>
-        <w:t xml:space="preserve">read </w:t>
-      </w:r>
-      <w:proofErr w:type="spellStart"/>
-      <w:r>
-        <w:rPr>
-          <w:rFonts w:ascii="Times New Roman" w:hAnsi="Times New Roman"/>
-          <w:sz w:val="24"/>
-          <w:szCs w:val="24"/>
-          <w:lang w:val="en-IN"/>
-        </w:rPr>
-        <w:t>college_name</w:t>
-      </w:r>
-      <w:proofErr w:type="spellEnd"/>
-    </w:p>
-    <w:p>
-      <w:pPr>
-        <w:rPr>
-          <w:rFonts w:ascii="Times New Roman" w:hAnsi="Times New Roman"/>
-          <w:sz w:val="24"/>
-          <w:szCs w:val="24"/>
-          <w:lang w:val="en-IN"/>
-        </w:rPr>
-      </w:pPr>
-      <w:r>
-        <w:rPr>
-          <w:rFonts w:ascii="Times New Roman" w:hAnsi="Times New Roman"/>
-          <w:sz w:val="24"/>
-          <w:szCs w:val="24"/>
-          <w:lang w:val="en-IN"/>
-        </w:rPr>
-        <w:t>echo "My College Name is: $</w:t>
-      </w:r>
-      <w:proofErr w:type="spellStart"/>
-      <w:r>
-        <w:rPr>
-          <w:rFonts w:ascii="Times New Roman" w:hAnsi="Times New Roman"/>
-          <w:sz w:val="24"/>
-          <w:szCs w:val="24"/>
-          <w:lang w:val="en-IN"/>
-        </w:rPr>
-        <w:t>college_name</w:t>
-      </w:r>
-      <w:proofErr w:type="spellEnd"/>
-      <w:r>
-        <w:rPr>
-          <w:rFonts w:ascii="Times New Roman" w:hAnsi="Times New Roman"/>
-          <w:sz w:val="24"/>
-          <w:szCs w:val="24"/>
-          <w:lang w:val="en-IN"/>
-        </w:rPr>
-        <w:t>"</w:t>
+        <w:t>read college_name</w:t>
+      </w:r>
+    </w:p>
+    <w:p>
+      <w:pPr>
+        <w:rPr>
+          <w:rFonts w:ascii="Times New Roman" w:hAnsi="Times New Roman"/>
+          <w:sz w:val="24"/>
+          <w:szCs w:val="24"/>
+          <w:lang w:val="en-IN"/>
+        </w:rPr>
+      </w:pPr>
+      <w:r>
+        <w:rPr>
+          <w:rFonts w:ascii="Times New Roman" w:hAnsi="Times New Roman"/>
+          <w:sz w:val="24"/>
+          <w:szCs w:val="24"/>
+          <w:lang w:val="en-IN"/>
+        </w:rPr>
+        <w:t>echo "My College Name is: $college_name"</w:t>
       </w:r>
     </w:p>
     <w:p>
@@ -7404,27 +7099,7 @@
           <w:lang w:val="en-IN"/>
         </w:rPr>
         <w:lastRenderedPageBreak/>
-        <w:t xml:space="preserve">Write a shell script to scan two variables and to display their sum, </w:t>
-      </w:r>
-      <w:proofErr w:type="spellStart"/>
-      <w:r>
-        <w:rPr>
-          <w:rFonts w:ascii="Times New Roman" w:hAnsi="Times New Roman"/>
-          <w:sz w:val="24"/>
-          <w:szCs w:val="24"/>
-          <w:lang w:val="en-IN"/>
-        </w:rPr>
-        <w:t>mul</w:t>
-      </w:r>
-      <w:proofErr w:type="spellEnd"/>
-      <w:r>
-        <w:rPr>
-          <w:rFonts w:ascii="Times New Roman" w:hAnsi="Times New Roman"/>
-          <w:sz w:val="24"/>
-          <w:szCs w:val="24"/>
-          <w:lang w:val="en-IN"/>
-        </w:rPr>
-        <w:t>, div,</w:t>
+        <w:t>Write a shell script to scan two variables and to display their sum, mul, div,</w:t>
       </w:r>
     </w:p>
     <w:p>
@@ -7466,27 +7141,7 @@
           <w:szCs w:val="24"/>
           <w:lang w:val="en-IN"/>
         </w:rPr>
-        <w:t xml:space="preserve">display their sum, </w:t>
-      </w:r>
-      <w:proofErr w:type="spellStart"/>
-      <w:r>
-        <w:rPr>
-          <w:rFonts w:ascii="Times New Roman" w:hAnsi="Times New Roman"/>
-          <w:sz w:val="24"/>
-          <w:szCs w:val="24"/>
-          <w:lang w:val="en-IN"/>
-        </w:rPr>
-        <w:t>mul</w:t>
-      </w:r>
-      <w:proofErr w:type="spellEnd"/>
-      <w:r>
-        <w:rPr>
-          <w:rFonts w:ascii="Times New Roman" w:hAnsi="Times New Roman"/>
-          <w:sz w:val="24"/>
-          <w:szCs w:val="24"/>
-          <w:lang w:val="en-IN"/>
-        </w:rPr>
-        <w:t>, div, sub and modulo division as per the user choice.</w:t>
+        <w:t>display their sum, mul, div, sub and modulo division as per the user choice.</w:t>
       </w:r>
     </w:p>
     <w:p>
@@ -7507,27 +7162,7 @@
           <w:szCs w:val="24"/>
           <w:lang w:val="en-IN"/>
         </w:rPr>
-        <w:t>(</w:t>
-      </w:r>
-      <w:proofErr w:type="gramStart"/>
-      <w:r>
-        <w:rPr>
-          <w:rFonts w:ascii="Times New Roman" w:hAnsi="Times New Roman"/>
-          <w:sz w:val="24"/>
-          <w:szCs w:val="24"/>
-          <w:lang w:val="en-IN"/>
-        </w:rPr>
-        <w:t>no</w:t>
-      </w:r>
-      <w:proofErr w:type="gramEnd"/>
-      <w:r>
-        <w:rPr>
-          <w:rFonts w:ascii="Times New Roman" w:hAnsi="Times New Roman"/>
-          <w:sz w:val="24"/>
-          <w:szCs w:val="24"/>
-          <w:lang w:val="en-IN"/>
-        </w:rPr>
-        <w:t xml:space="preserve"> need to continue, only once is OK)</w:t>
+        <w:t>(no need to continue, only once is OK)</w:t>
       </w:r>
     </w:p>
     <w:p>
@@ -7680,25 +7315,14 @@
           <w:lang w:val="en-IN"/>
         </w:rPr>
       </w:pPr>
-      <w:proofErr w:type="spellStart"/>
-      <w:r>
-        <w:rPr>
-          <w:rFonts w:ascii="Times New Roman" w:hAnsi="Times New Roman"/>
-          <w:sz w:val="24"/>
-          <w:szCs w:val="24"/>
-          <w:lang w:val="en-IN"/>
-        </w:rPr>
-        <w:t>mul</w:t>
-      </w:r>
-      <w:proofErr w:type="spellEnd"/>
-      <w:r>
-        <w:rPr>
-          <w:rFonts w:ascii="Times New Roman" w:hAnsi="Times New Roman"/>
-          <w:sz w:val="24"/>
-          <w:szCs w:val="24"/>
-          <w:lang w:val="en-IN"/>
-        </w:rPr>
-        <w:t>=`expr $num1 \* $num2`</w:t>
+      <w:r>
+        <w:rPr>
+          <w:rFonts w:ascii="Times New Roman" w:hAnsi="Times New Roman"/>
+          <w:sz w:val="24"/>
+          <w:szCs w:val="24"/>
+          <w:lang w:val="en-IN"/>
+        </w:rPr>
+        <w:t>mul=`expr $num1 \* $num2`</w:t>
       </w:r>
     </w:p>
     <w:p>
@@ -7793,66 +7417,26 @@
           <w:szCs w:val="24"/>
           <w:lang w:val="en-IN"/>
         </w:rPr>
-        <w:t>echo "Mul: $</w:t>
-      </w:r>
-      <w:proofErr w:type="spellStart"/>
-      <w:r>
-        <w:rPr>
-          <w:rFonts w:ascii="Times New Roman" w:hAnsi="Times New Roman"/>
-          <w:sz w:val="24"/>
-          <w:szCs w:val="24"/>
-          <w:lang w:val="en-IN"/>
-        </w:rPr>
-        <w:t>mul</w:t>
-      </w:r>
-      <w:proofErr w:type="spellEnd"/>
-      <w:r>
-        <w:rPr>
-          <w:rFonts w:ascii="Times New Roman" w:hAnsi="Times New Roman"/>
-          <w:sz w:val="24"/>
-          <w:szCs w:val="24"/>
-          <w:lang w:val="en-IN"/>
-        </w:rPr>
-        <w:t>"</w:t>
-      </w:r>
-    </w:p>
-    <w:p>
-      <w:pPr>
-        <w:rPr>
-          <w:rFonts w:ascii="Times New Roman" w:hAnsi="Times New Roman"/>
-          <w:sz w:val="24"/>
-          <w:szCs w:val="24"/>
-          <w:lang w:val="en-IN"/>
-        </w:rPr>
-      </w:pPr>
-      <w:r>
-        <w:rPr>
-          <w:rFonts w:ascii="Times New Roman" w:hAnsi="Times New Roman"/>
-          <w:sz w:val="24"/>
-          <w:szCs w:val="24"/>
-          <w:lang w:val="en-IN"/>
-        </w:rPr>
-        <w:t>echo "</w:t>
-      </w:r>
-      <w:proofErr w:type="spellStart"/>
-      <w:r>
-        <w:rPr>
-          <w:rFonts w:ascii="Times New Roman" w:hAnsi="Times New Roman"/>
-          <w:sz w:val="24"/>
-          <w:szCs w:val="24"/>
-          <w:lang w:val="en-IN"/>
-        </w:rPr>
-        <w:t>Div</w:t>
-      </w:r>
-      <w:proofErr w:type="spellEnd"/>
-      <w:r>
-        <w:rPr>
-          <w:rFonts w:ascii="Times New Roman" w:hAnsi="Times New Roman"/>
-          <w:sz w:val="24"/>
-          <w:szCs w:val="24"/>
-          <w:lang w:val="en-IN"/>
-        </w:rPr>
-        <w:t>: $div"</w:t>
+        <w:t>echo "Mul: $mul"</w:t>
+      </w:r>
+    </w:p>
+    <w:p>
+      <w:pPr>
+        <w:rPr>
+          <w:rFonts w:ascii="Times New Roman" w:hAnsi="Times New Roman"/>
+          <w:sz w:val="24"/>
+          <w:szCs w:val="24"/>
+          <w:lang w:val="en-IN"/>
+        </w:rPr>
+      </w:pPr>
+      <w:r>
+        <w:rPr>
+          <w:rFonts w:ascii="Times New Roman" w:hAnsi="Times New Roman"/>
+          <w:sz w:val="24"/>
+          <w:szCs w:val="24"/>
+          <w:lang w:val="en-IN"/>
+        </w:rPr>
+        <w:t>echo "Div: $div"</w:t>
       </w:r>
     </w:p>
     <w:p>
@@ -8176,27 +7760,7 @@
           <w:szCs w:val="24"/>
           <w:lang w:val="en-IN"/>
         </w:rPr>
-        <w:t xml:space="preserve">echo "4. </w:t>
-      </w:r>
-      <w:proofErr w:type="spellStart"/>
-      <w:r>
-        <w:rPr>
-          <w:rFonts w:ascii="Times New Roman" w:hAnsi="Times New Roman"/>
-          <w:sz w:val="24"/>
-          <w:szCs w:val="24"/>
-          <w:lang w:val="en-IN"/>
-        </w:rPr>
-        <w:t>Div</w:t>
-      </w:r>
-      <w:proofErr w:type="spellEnd"/>
-      <w:r>
-        <w:rPr>
-          <w:rFonts w:ascii="Times New Roman" w:hAnsi="Times New Roman"/>
-          <w:sz w:val="24"/>
-          <w:szCs w:val="24"/>
-          <w:lang w:val="en-IN"/>
-        </w:rPr>
-        <w:t>"</w:t>
+        <w:t>echo "4. Div"</w:t>
       </w:r>
     </w:p>
     <w:p>
@@ -8253,27 +7817,7 @@
           <w:szCs w:val="24"/>
           <w:lang w:val="en-IN"/>
         </w:rPr>
-        <w:t xml:space="preserve">if [ $choice = </w:t>
-      </w:r>
-      <w:proofErr w:type="gramStart"/>
-      <w:r>
-        <w:rPr>
-          <w:rFonts w:ascii="Times New Roman" w:hAnsi="Times New Roman"/>
-          <w:sz w:val="24"/>
-          <w:szCs w:val="24"/>
-          <w:lang w:val="en-IN"/>
-        </w:rPr>
-        <w:t>1 ]</w:t>
-      </w:r>
-      <w:proofErr w:type="gramEnd"/>
-      <w:r>
-        <w:rPr>
-          <w:rFonts w:ascii="Times New Roman" w:hAnsi="Times New Roman"/>
-          <w:sz w:val="24"/>
-          <w:szCs w:val="24"/>
-          <w:lang w:val="en-IN"/>
-        </w:rPr>
-        <w:t xml:space="preserve"> then</w:t>
+        <w:t>if [ $choice = 1 ] then</w:t>
       </w:r>
     </w:p>
     <w:p>
@@ -8323,45 +7867,14 @@
           <w:lang w:val="en-IN"/>
         </w:rPr>
       </w:pPr>
-      <w:proofErr w:type="spellStart"/>
-      <w:r>
-        <w:rPr>
-          <w:rFonts w:ascii="Times New Roman" w:hAnsi="Times New Roman"/>
-          <w:sz w:val="24"/>
-          <w:szCs w:val="24"/>
-          <w:lang w:val="en-IN"/>
-        </w:rPr>
-        <w:t>elif</w:t>
-      </w:r>
-      <w:proofErr w:type="spellEnd"/>
-      <w:r>
-        <w:rPr>
-          <w:rFonts w:ascii="Times New Roman" w:hAnsi="Times New Roman"/>
-          <w:sz w:val="24"/>
-          <w:szCs w:val="24"/>
-          <w:lang w:val="en-IN"/>
-        </w:rPr>
-        <w:t xml:space="preserve"> [ $choice = </w:t>
-      </w:r>
-      <w:proofErr w:type="gramStart"/>
-      <w:r>
-        <w:rPr>
-          <w:rFonts w:ascii="Times New Roman" w:hAnsi="Times New Roman"/>
-          <w:sz w:val="24"/>
-          <w:szCs w:val="24"/>
-          <w:lang w:val="en-IN"/>
-        </w:rPr>
-        <w:t>2 ]</w:t>
-      </w:r>
-      <w:proofErr w:type="gramEnd"/>
-      <w:r>
-        <w:rPr>
-          <w:rFonts w:ascii="Times New Roman" w:hAnsi="Times New Roman"/>
-          <w:sz w:val="24"/>
-          <w:szCs w:val="24"/>
-          <w:lang w:val="en-IN"/>
-        </w:rPr>
-        <w:t>; then</w:t>
+      <w:r>
+        <w:rPr>
+          <w:rFonts w:ascii="Times New Roman" w:hAnsi="Times New Roman"/>
+          <w:sz w:val="24"/>
+          <w:szCs w:val="24"/>
+          <w:lang w:val="en-IN"/>
+        </w:rPr>
+        <w:t>elif [ $choice = 2 ]; then</w:t>
       </w:r>
     </w:p>
     <w:p>
@@ -8411,173 +7924,71 @@
           <w:lang w:val="en-IN"/>
         </w:rPr>
       </w:pPr>
-      <w:proofErr w:type="spellStart"/>
-      <w:r>
-        <w:rPr>
-          <w:rFonts w:ascii="Times New Roman" w:hAnsi="Times New Roman"/>
-          <w:sz w:val="24"/>
-          <w:szCs w:val="24"/>
-          <w:lang w:val="en-IN"/>
-        </w:rPr>
-        <w:t>elif</w:t>
-      </w:r>
-      <w:proofErr w:type="spellEnd"/>
-      <w:r>
-        <w:rPr>
-          <w:rFonts w:ascii="Times New Roman" w:hAnsi="Times New Roman"/>
-          <w:sz w:val="24"/>
-          <w:szCs w:val="24"/>
-          <w:lang w:val="en-IN"/>
-        </w:rPr>
-        <w:t xml:space="preserve"> [ $choice = </w:t>
-      </w:r>
-      <w:proofErr w:type="gramStart"/>
-      <w:r>
-        <w:rPr>
-          <w:rFonts w:ascii="Times New Roman" w:hAnsi="Times New Roman"/>
-          <w:sz w:val="24"/>
-          <w:szCs w:val="24"/>
-          <w:lang w:val="en-IN"/>
-        </w:rPr>
-        <w:t>3 ]</w:t>
-      </w:r>
-      <w:proofErr w:type="gramEnd"/>
-      <w:r>
-        <w:rPr>
-          <w:rFonts w:ascii="Times New Roman" w:hAnsi="Times New Roman"/>
-          <w:sz w:val="24"/>
-          <w:szCs w:val="24"/>
-          <w:lang w:val="en-IN"/>
-        </w:rPr>
-        <w:t>; then</w:t>
-      </w:r>
-    </w:p>
-    <w:p>
-      <w:pPr>
-        <w:rPr>
-          <w:rFonts w:ascii="Times New Roman" w:hAnsi="Times New Roman"/>
-          <w:sz w:val="24"/>
-          <w:szCs w:val="24"/>
-          <w:lang w:val="en-IN"/>
-        </w:rPr>
-      </w:pPr>
-      <w:r>
-        <w:rPr>
-          <w:rFonts w:ascii="Times New Roman" w:hAnsi="Times New Roman"/>
-          <w:sz w:val="24"/>
-          <w:szCs w:val="24"/>
-          <w:lang w:val="en-IN"/>
-        </w:rPr>
-        <w:t xml:space="preserve">    </w:t>
-      </w:r>
-      <w:proofErr w:type="spellStart"/>
-      <w:r>
-        <w:rPr>
-          <w:rFonts w:ascii="Times New Roman" w:hAnsi="Times New Roman"/>
-          <w:sz w:val="24"/>
-          <w:szCs w:val="24"/>
-          <w:lang w:val="en-IN"/>
-        </w:rPr>
-        <w:t>mul</w:t>
-      </w:r>
-      <w:proofErr w:type="spellEnd"/>
-      <w:r>
-        <w:rPr>
-          <w:rFonts w:ascii="Times New Roman" w:hAnsi="Times New Roman"/>
-          <w:sz w:val="24"/>
-          <w:szCs w:val="24"/>
-          <w:lang w:val="en-IN"/>
-        </w:rPr>
-        <w:t>=`expr $num1 \* $num2`</w:t>
-      </w:r>
-    </w:p>
-    <w:p>
-      <w:pPr>
-        <w:rPr>
-          <w:rFonts w:ascii="Times New Roman" w:hAnsi="Times New Roman"/>
-          <w:sz w:val="24"/>
-          <w:szCs w:val="24"/>
-          <w:lang w:val="en-IN"/>
-        </w:rPr>
-      </w:pPr>
-      <w:r>
-        <w:rPr>
-          <w:rFonts w:ascii="Times New Roman" w:hAnsi="Times New Roman"/>
-          <w:sz w:val="24"/>
-          <w:szCs w:val="24"/>
-          <w:lang w:val="en-IN"/>
-        </w:rPr>
-        <w:t xml:space="preserve">    echo "Multiplication: $</w:t>
-      </w:r>
-      <w:proofErr w:type="spellStart"/>
-      <w:r>
-        <w:rPr>
-          <w:rFonts w:ascii="Times New Roman" w:hAnsi="Times New Roman"/>
-          <w:sz w:val="24"/>
-          <w:szCs w:val="24"/>
-          <w:lang w:val="en-IN"/>
-        </w:rPr>
-        <w:t>mul</w:t>
-      </w:r>
-      <w:proofErr w:type="spellEnd"/>
-      <w:r>
-        <w:rPr>
-          <w:rFonts w:ascii="Times New Roman" w:hAnsi="Times New Roman"/>
-          <w:sz w:val="24"/>
-          <w:szCs w:val="24"/>
-          <w:lang w:val="en-IN"/>
-        </w:rPr>
-        <w:t>"</w:t>
-      </w:r>
-    </w:p>
-    <w:p>
-      <w:pPr>
-        <w:rPr>
-          <w:rFonts w:ascii="Times New Roman" w:hAnsi="Times New Roman"/>
-          <w:sz w:val="24"/>
-          <w:szCs w:val="24"/>
-          <w:lang w:val="en-IN"/>
-        </w:rPr>
-      </w:pPr>
-      <w:proofErr w:type="spellStart"/>
-      <w:r>
-        <w:rPr>
-          <w:rFonts w:ascii="Times New Roman" w:hAnsi="Times New Roman"/>
-          <w:sz w:val="24"/>
-          <w:szCs w:val="24"/>
-          <w:lang w:val="en-IN"/>
-        </w:rPr>
-        <w:t>elif</w:t>
-      </w:r>
-      <w:proofErr w:type="spellEnd"/>
-      <w:r>
-        <w:rPr>
-          <w:rFonts w:ascii="Times New Roman" w:hAnsi="Times New Roman"/>
-          <w:sz w:val="24"/>
-          <w:szCs w:val="24"/>
-          <w:lang w:val="en-IN"/>
-        </w:rPr>
-        <w:t xml:space="preserve"> [ $choice = </w:t>
-      </w:r>
-      <w:proofErr w:type="gramStart"/>
-      <w:r>
-        <w:rPr>
-          <w:rFonts w:ascii="Times New Roman" w:hAnsi="Times New Roman"/>
-          <w:sz w:val="24"/>
-          <w:szCs w:val="24"/>
-          <w:lang w:val="en-IN"/>
-        </w:rPr>
-        <w:t>4 ]</w:t>
-      </w:r>
-      <w:proofErr w:type="gramEnd"/>
-      <w:r>
-        <w:rPr>
-          <w:rFonts w:ascii="Times New Roman" w:hAnsi="Times New Roman"/>
-          <w:sz w:val="24"/>
-          <w:szCs w:val="24"/>
-          <w:lang w:val="en-IN"/>
-        </w:rPr>
-        <w:t>; then</w:t>
+      <w:r>
+        <w:rPr>
+          <w:rFonts w:ascii="Times New Roman" w:hAnsi="Times New Roman"/>
+          <w:sz w:val="24"/>
+          <w:szCs w:val="24"/>
+          <w:lang w:val="en-IN"/>
+        </w:rPr>
+        <w:t>elif [ $choice = 3 ]; then</w:t>
+      </w:r>
+    </w:p>
+    <w:p>
+      <w:pPr>
+        <w:rPr>
+          <w:rFonts w:ascii="Times New Roman" w:hAnsi="Times New Roman"/>
+          <w:sz w:val="24"/>
+          <w:szCs w:val="24"/>
+          <w:lang w:val="en-IN"/>
+        </w:rPr>
+      </w:pPr>
+      <w:r>
+        <w:rPr>
+          <w:rFonts w:ascii="Times New Roman" w:hAnsi="Times New Roman"/>
+          <w:sz w:val="24"/>
+          <w:szCs w:val="24"/>
+          <w:lang w:val="en-IN"/>
+        </w:rPr>
+        <w:t xml:space="preserve">    mul=`expr $num1 \* $num2`</w:t>
+      </w:r>
+    </w:p>
+    <w:p>
+      <w:pPr>
+        <w:rPr>
+          <w:rFonts w:ascii="Times New Roman" w:hAnsi="Times New Roman"/>
+          <w:sz w:val="24"/>
+          <w:szCs w:val="24"/>
+          <w:lang w:val="en-IN"/>
+        </w:rPr>
+      </w:pPr>
+      <w:r>
+        <w:rPr>
+          <w:rFonts w:ascii="Times New Roman" w:hAnsi="Times New Roman"/>
+          <w:sz w:val="24"/>
+          <w:szCs w:val="24"/>
+          <w:lang w:val="en-IN"/>
+        </w:rPr>
+        <w:t xml:space="preserve">    echo "Multiplication: $mul"</w:t>
+      </w:r>
+    </w:p>
+    <w:p>
+      <w:pPr>
+        <w:rPr>
+          <w:rFonts w:ascii="Times New Roman" w:hAnsi="Times New Roman"/>
+          <w:sz w:val="24"/>
+          <w:szCs w:val="24"/>
+          <w:lang w:val="en-IN"/>
+        </w:rPr>
+      </w:pPr>
+      <w:r>
+        <w:rPr>
+          <w:rFonts w:ascii="Times New Roman" w:hAnsi="Times New Roman"/>
+          <w:sz w:val="24"/>
+          <w:szCs w:val="24"/>
+          <w:lang w:val="en-IN"/>
+        </w:rPr>
+        <w:t>elif [ $choice = 4 ]; then</w:t>
       </w:r>
     </w:p>
     <w:p>
@@ -8627,45 +8038,14 @@
           <w:lang w:val="en-IN"/>
         </w:rPr>
       </w:pPr>
-      <w:proofErr w:type="spellStart"/>
-      <w:r>
-        <w:rPr>
-          <w:rFonts w:ascii="Times New Roman" w:hAnsi="Times New Roman"/>
-          <w:sz w:val="24"/>
-          <w:szCs w:val="24"/>
-          <w:lang w:val="en-IN"/>
-        </w:rPr>
-        <w:t>elif</w:t>
-      </w:r>
-      <w:proofErr w:type="spellEnd"/>
-      <w:r>
-        <w:rPr>
-          <w:rFonts w:ascii="Times New Roman" w:hAnsi="Times New Roman"/>
-          <w:sz w:val="24"/>
-          <w:szCs w:val="24"/>
-          <w:lang w:val="en-IN"/>
-        </w:rPr>
-        <w:t xml:space="preserve"> [ $choice = </w:t>
-      </w:r>
-      <w:proofErr w:type="gramStart"/>
-      <w:r>
-        <w:rPr>
-          <w:rFonts w:ascii="Times New Roman" w:hAnsi="Times New Roman"/>
-          <w:sz w:val="24"/>
-          <w:szCs w:val="24"/>
-          <w:lang w:val="en-IN"/>
-        </w:rPr>
-        <w:t>5 ]</w:t>
-      </w:r>
-      <w:proofErr w:type="gramEnd"/>
-      <w:r>
-        <w:rPr>
-          <w:rFonts w:ascii="Times New Roman" w:hAnsi="Times New Roman"/>
-          <w:sz w:val="24"/>
-          <w:szCs w:val="24"/>
-          <w:lang w:val="en-IN"/>
-        </w:rPr>
-        <w:t>; then</w:t>
+      <w:r>
+        <w:rPr>
+          <w:rFonts w:ascii="Times New Roman" w:hAnsi="Times New Roman"/>
+          <w:sz w:val="24"/>
+          <w:szCs w:val="24"/>
+          <w:lang w:val="en-IN"/>
+        </w:rPr>
+        <w:t>elif [ $choice = 5 ]; then</w:t>
       </w:r>
     </w:p>
     <w:p>
@@ -8987,47 +8367,7 @@
           <w:szCs w:val="24"/>
           <w:lang w:val="en-IN"/>
         </w:rPr>
-        <w:t>if [ $num1 -</w:t>
-      </w:r>
-      <w:proofErr w:type="spellStart"/>
-      <w:r>
-        <w:rPr>
-          <w:rFonts w:ascii="Times New Roman" w:hAnsi="Times New Roman"/>
-          <w:sz w:val="24"/>
-          <w:szCs w:val="24"/>
-          <w:lang w:val="en-IN"/>
-        </w:rPr>
-        <w:t>eq</w:t>
-      </w:r>
-      <w:proofErr w:type="spellEnd"/>
-      <w:r>
-        <w:rPr>
-          <w:rFonts w:ascii="Times New Roman" w:hAnsi="Times New Roman"/>
-          <w:sz w:val="24"/>
-          <w:szCs w:val="24"/>
-          <w:lang w:val="en-IN"/>
-        </w:rPr>
-        <w:t xml:space="preserve"> $num</w:t>
-      </w:r>
-      <w:proofErr w:type="gramStart"/>
-      <w:r>
-        <w:rPr>
-          <w:rFonts w:ascii="Times New Roman" w:hAnsi="Times New Roman"/>
-          <w:sz w:val="24"/>
-          <w:szCs w:val="24"/>
-          <w:lang w:val="en-IN"/>
-        </w:rPr>
-        <w:t>2 ]</w:t>
-      </w:r>
-      <w:proofErr w:type="gramEnd"/>
-      <w:r>
-        <w:rPr>
-          <w:rFonts w:ascii="Times New Roman" w:hAnsi="Times New Roman"/>
-          <w:sz w:val="24"/>
-          <w:szCs w:val="24"/>
-          <w:lang w:val="en-IN"/>
-        </w:rPr>
-        <w:t>; then</w:t>
+        <w:t>if [ $num1 -eq $num2 ]; then</w:t>
       </w:r>
     </w:p>
     <w:p>
@@ -9058,65 +8398,14 @@
           <w:lang w:val="en-IN"/>
         </w:rPr>
       </w:pPr>
-      <w:proofErr w:type="spellStart"/>
-      <w:r>
-        <w:rPr>
-          <w:rFonts w:ascii="Times New Roman" w:hAnsi="Times New Roman"/>
-          <w:sz w:val="24"/>
-          <w:szCs w:val="24"/>
-          <w:lang w:val="en-IN"/>
-        </w:rPr>
-        <w:t>elif</w:t>
-      </w:r>
-      <w:proofErr w:type="spellEnd"/>
-      <w:r>
-        <w:rPr>
-          <w:rFonts w:ascii="Times New Roman" w:hAnsi="Times New Roman"/>
-          <w:sz w:val="24"/>
-          <w:szCs w:val="24"/>
-          <w:lang w:val="en-IN"/>
-        </w:rPr>
-        <w:t xml:space="preserve"> [ $num1 -</w:t>
-      </w:r>
-      <w:proofErr w:type="spellStart"/>
-      <w:r>
-        <w:rPr>
-          <w:rFonts w:ascii="Times New Roman" w:hAnsi="Times New Roman"/>
-          <w:sz w:val="24"/>
-          <w:szCs w:val="24"/>
-          <w:lang w:val="en-IN"/>
-        </w:rPr>
-        <w:t>gt</w:t>
-      </w:r>
-      <w:proofErr w:type="spellEnd"/>
-      <w:r>
-        <w:rPr>
-          <w:rFonts w:ascii="Times New Roman" w:hAnsi="Times New Roman"/>
-          <w:sz w:val="24"/>
-          <w:szCs w:val="24"/>
-          <w:lang w:val="en-IN"/>
-        </w:rPr>
-        <w:t xml:space="preserve"> $num</w:t>
-      </w:r>
-      <w:proofErr w:type="gramStart"/>
-      <w:r>
-        <w:rPr>
-          <w:rFonts w:ascii="Times New Roman" w:hAnsi="Times New Roman"/>
-          <w:sz w:val="24"/>
-          <w:szCs w:val="24"/>
-          <w:lang w:val="en-IN"/>
-        </w:rPr>
-        <w:t>2 ]</w:t>
-      </w:r>
-      <w:proofErr w:type="gramEnd"/>
-      <w:r>
-        <w:rPr>
-          <w:rFonts w:ascii="Times New Roman" w:hAnsi="Times New Roman"/>
-          <w:sz w:val="24"/>
-          <w:szCs w:val="24"/>
-          <w:lang w:val="en-IN"/>
-        </w:rPr>
-        <w:t>; then</w:t>
+      <w:r>
+        <w:rPr>
+          <w:rFonts w:ascii="Times New Roman" w:hAnsi="Times New Roman"/>
+          <w:sz w:val="24"/>
+          <w:szCs w:val="24"/>
+          <w:lang w:val="en-IN"/>
+        </w:rPr>
+        <w:t>elif [ $num1 -gt $num2 ]; then</w:t>
       </w:r>
     </w:p>
     <w:p>
@@ -9378,517 +8667,532 @@
           <w:szCs w:val="24"/>
           <w:lang w:val="en-IN"/>
         </w:rPr>
-        <w:t>echo "Enter Three Numbers: "</w:t>
-      </w:r>
-    </w:p>
-    <w:p>
-      <w:pPr>
-        <w:rPr>
-          <w:rFonts w:ascii="Times New Roman" w:hAnsi="Times New Roman"/>
-          <w:sz w:val="24"/>
-          <w:szCs w:val="24"/>
-          <w:lang w:val="en-IN"/>
-        </w:rPr>
-      </w:pPr>
-      <w:r>
-        <w:rPr>
-          <w:rFonts w:ascii="Times New Roman" w:hAnsi="Times New Roman"/>
-          <w:sz w:val="24"/>
-          <w:szCs w:val="24"/>
-          <w:lang w:val="en-IN"/>
-        </w:rPr>
-        <w:t xml:space="preserve">read num1 </w:t>
-      </w:r>
-    </w:p>
-    <w:p>
-      <w:pPr>
-        <w:rPr>
-          <w:rFonts w:ascii="Times New Roman" w:hAnsi="Times New Roman"/>
-          <w:sz w:val="24"/>
-          <w:szCs w:val="24"/>
-          <w:lang w:val="en-IN"/>
-        </w:rPr>
-      </w:pPr>
-      <w:r>
-        <w:rPr>
-          <w:rFonts w:ascii="Times New Roman" w:hAnsi="Times New Roman"/>
-          <w:sz w:val="24"/>
-          <w:szCs w:val="24"/>
-          <w:lang w:val="en-IN"/>
-        </w:rPr>
-        <w:t>read num2</w:t>
-      </w:r>
-    </w:p>
-    <w:p>
-      <w:pPr>
-        <w:rPr>
-          <w:rFonts w:ascii="Times New Roman" w:hAnsi="Times New Roman"/>
-          <w:sz w:val="24"/>
-          <w:szCs w:val="24"/>
-          <w:lang w:val="en-IN"/>
-        </w:rPr>
-      </w:pPr>
-      <w:r>
-        <w:rPr>
-          <w:rFonts w:ascii="Times New Roman" w:hAnsi="Times New Roman"/>
-          <w:sz w:val="24"/>
-          <w:szCs w:val="24"/>
-          <w:lang w:val="en-IN"/>
-        </w:rPr>
-        <w:t>read num3</w:t>
-      </w:r>
-    </w:p>
-    <w:p>
-      <w:pPr>
-        <w:rPr>
-          <w:rFonts w:ascii="Times New Roman" w:hAnsi="Times New Roman"/>
-          <w:sz w:val="24"/>
-          <w:szCs w:val="24"/>
-          <w:lang w:val="en-IN"/>
-        </w:rPr>
-      </w:pPr>
-      <w:r>
-        <w:rPr>
-          <w:rFonts w:ascii="Times New Roman" w:hAnsi="Times New Roman"/>
-          <w:sz w:val="24"/>
-          <w:szCs w:val="24"/>
-          <w:lang w:val="en-IN"/>
-        </w:rPr>
-        <w:t>if [ $num1 -</w:t>
-      </w:r>
-      <w:proofErr w:type="spellStart"/>
-      <w:r>
-        <w:rPr>
-          <w:rFonts w:ascii="Times New Roman" w:hAnsi="Times New Roman"/>
-          <w:sz w:val="24"/>
-          <w:szCs w:val="24"/>
-          <w:lang w:val="en-IN"/>
-        </w:rPr>
-        <w:t>eq</w:t>
-      </w:r>
-      <w:proofErr w:type="spellEnd"/>
-      <w:r>
-        <w:rPr>
-          <w:rFonts w:ascii="Times New Roman" w:hAnsi="Times New Roman"/>
-          <w:sz w:val="24"/>
-          <w:szCs w:val="24"/>
-          <w:lang w:val="en-IN"/>
-        </w:rPr>
-        <w:t xml:space="preserve"> $num</w:t>
-      </w:r>
-      <w:proofErr w:type="gramStart"/>
-      <w:r>
-        <w:rPr>
-          <w:rFonts w:ascii="Times New Roman" w:hAnsi="Times New Roman"/>
-          <w:sz w:val="24"/>
-          <w:szCs w:val="24"/>
-          <w:lang w:val="en-IN"/>
-        </w:rPr>
-        <w:t>2 ]</w:t>
-      </w:r>
-      <w:proofErr w:type="gramEnd"/>
-      <w:r>
-        <w:rPr>
-          <w:rFonts w:ascii="Times New Roman" w:hAnsi="Times New Roman"/>
-          <w:sz w:val="24"/>
-          <w:szCs w:val="24"/>
-          <w:lang w:val="en-IN"/>
-        </w:rPr>
-        <w:t xml:space="preserve"> &amp;&amp; [ $num2 -</w:t>
-      </w:r>
-      <w:proofErr w:type="spellStart"/>
-      <w:r>
-        <w:rPr>
-          <w:rFonts w:ascii="Times New Roman" w:hAnsi="Times New Roman"/>
-          <w:sz w:val="24"/>
-          <w:szCs w:val="24"/>
-          <w:lang w:val="en-IN"/>
-        </w:rPr>
-        <w:t>eq</w:t>
-      </w:r>
-      <w:proofErr w:type="spellEnd"/>
-      <w:r>
-        <w:rPr>
-          <w:rFonts w:ascii="Times New Roman" w:hAnsi="Times New Roman"/>
-          <w:sz w:val="24"/>
-          <w:szCs w:val="24"/>
-          <w:lang w:val="en-IN"/>
-        </w:rPr>
-        <w:t xml:space="preserve"> $num3]; then</w:t>
-      </w:r>
-    </w:p>
-    <w:p>
-      <w:pPr>
-        <w:rPr>
-          <w:rFonts w:ascii="Times New Roman" w:hAnsi="Times New Roman"/>
-          <w:sz w:val="24"/>
-          <w:szCs w:val="24"/>
-          <w:lang w:val="en-IN"/>
-        </w:rPr>
-      </w:pPr>
-      <w:r>
-        <w:rPr>
-          <w:rFonts w:ascii="Times New Roman" w:hAnsi="Times New Roman"/>
-          <w:sz w:val="24"/>
-          <w:szCs w:val="24"/>
-          <w:lang w:val="en-IN"/>
-        </w:rPr>
-        <w:t xml:space="preserve">    echo "</w:t>
-      </w:r>
-      <w:r>
-        <w:rPr>
-          <w:rFonts w:ascii="Times New Roman" w:hAnsi="Times New Roman"/>
-          <w:sz w:val="24"/>
-          <w:szCs w:val="24"/>
-          <w:lang w:val="en-IN"/>
-        </w:rPr>
-        <w:t xml:space="preserve">All </w:t>
-      </w:r>
-      <w:r>
-        <w:rPr>
-          <w:rFonts w:ascii="Times New Roman" w:hAnsi="Times New Roman"/>
-          <w:sz w:val="24"/>
-          <w:szCs w:val="24"/>
-          <w:lang w:val="en-IN"/>
-        </w:rPr>
-        <w:t>are Equal"</w:t>
-      </w:r>
-    </w:p>
-    <w:p>
-      <w:pPr>
-        <w:rPr>
-          <w:rFonts w:ascii="Times New Roman" w:hAnsi="Times New Roman"/>
-          <w:sz w:val="24"/>
-          <w:szCs w:val="24"/>
-          <w:lang w:val="en-IN"/>
-        </w:rPr>
-      </w:pPr>
-      <w:proofErr w:type="spellStart"/>
-      <w:r>
-        <w:rPr>
-          <w:rFonts w:ascii="Times New Roman" w:hAnsi="Times New Roman"/>
-          <w:sz w:val="24"/>
-          <w:szCs w:val="24"/>
-          <w:lang w:val="en-IN"/>
-        </w:rPr>
-        <w:t>elif</w:t>
-      </w:r>
-      <w:proofErr w:type="spellEnd"/>
-      <w:r>
-        <w:rPr>
-          <w:rFonts w:ascii="Times New Roman" w:hAnsi="Times New Roman"/>
-          <w:sz w:val="24"/>
-          <w:szCs w:val="24"/>
-          <w:lang w:val="en-IN"/>
-        </w:rPr>
-        <w:t xml:space="preserve"> [ $num1 -</w:t>
-      </w:r>
-      <w:proofErr w:type="spellStart"/>
-      <w:r>
-        <w:rPr>
-          <w:rFonts w:ascii="Times New Roman" w:hAnsi="Times New Roman"/>
-          <w:sz w:val="24"/>
-          <w:szCs w:val="24"/>
-          <w:lang w:val="en-IN"/>
-        </w:rPr>
-        <w:t>gt</w:t>
-      </w:r>
-      <w:proofErr w:type="spellEnd"/>
-      <w:r>
-        <w:rPr>
-          <w:rFonts w:ascii="Times New Roman" w:hAnsi="Times New Roman"/>
-          <w:sz w:val="24"/>
-          <w:szCs w:val="24"/>
-          <w:lang w:val="en-IN"/>
-        </w:rPr>
-        <w:t xml:space="preserve"> $num</w:t>
-      </w:r>
-      <w:proofErr w:type="gramStart"/>
-      <w:r>
-        <w:rPr>
-          <w:rFonts w:ascii="Times New Roman" w:hAnsi="Times New Roman"/>
-          <w:sz w:val="24"/>
-          <w:szCs w:val="24"/>
-          <w:lang w:val="en-IN"/>
-        </w:rPr>
-        <w:t>2 ]</w:t>
-      </w:r>
-      <w:proofErr w:type="gramEnd"/>
-      <w:r>
-        <w:rPr>
-          <w:rFonts w:ascii="Times New Roman" w:hAnsi="Times New Roman"/>
-          <w:sz w:val="24"/>
-          <w:szCs w:val="24"/>
-          <w:lang w:val="en-IN"/>
-        </w:rPr>
-        <w:t xml:space="preserve"> &amp;&amp; [ $num1 -</w:t>
-      </w:r>
-      <w:proofErr w:type="spellStart"/>
-      <w:r>
-        <w:rPr>
-          <w:rFonts w:ascii="Times New Roman" w:hAnsi="Times New Roman"/>
-          <w:sz w:val="24"/>
-          <w:szCs w:val="24"/>
-          <w:lang w:val="en-IN"/>
-        </w:rPr>
-        <w:t>gt</w:t>
-      </w:r>
-      <w:proofErr w:type="spellEnd"/>
-      <w:r>
-        <w:rPr>
-          <w:rFonts w:ascii="Times New Roman" w:hAnsi="Times New Roman"/>
-          <w:sz w:val="24"/>
-          <w:szCs w:val="24"/>
-          <w:lang w:val="en-IN"/>
-        </w:rPr>
-        <w:t xml:space="preserve"> $num3 ]; then</w:t>
-      </w:r>
-    </w:p>
-    <w:p>
-      <w:pPr>
-        <w:rPr>
-          <w:rFonts w:ascii="Times New Roman" w:hAnsi="Times New Roman"/>
-          <w:sz w:val="24"/>
-          <w:szCs w:val="24"/>
-          <w:lang w:val="en-IN"/>
-        </w:rPr>
-      </w:pPr>
-      <w:r>
-        <w:rPr>
-          <w:rFonts w:ascii="Times New Roman" w:hAnsi="Times New Roman"/>
-          <w:sz w:val="24"/>
-          <w:szCs w:val="24"/>
-          <w:lang w:val="en-IN"/>
-        </w:rPr>
-        <w:t xml:space="preserve">    echo "$num1 is Greater than $num2</w:t>
-      </w:r>
-      <w:r>
-        <w:rPr>
-          <w:rFonts w:ascii="Times New Roman" w:hAnsi="Times New Roman"/>
-          <w:sz w:val="24"/>
-          <w:szCs w:val="24"/>
-          <w:lang w:val="en-IN"/>
-        </w:rPr>
-        <w:t xml:space="preserve"> &amp; $num3</w:t>
-      </w:r>
-      <w:r>
-        <w:rPr>
-          <w:rFonts w:ascii="Times New Roman" w:hAnsi="Times New Roman"/>
-          <w:sz w:val="24"/>
-          <w:szCs w:val="24"/>
-          <w:lang w:val="en-IN"/>
-        </w:rPr>
-        <w:t>"</w:t>
-      </w:r>
-    </w:p>
-    <w:p>
-      <w:pPr>
-        <w:rPr>
-          <w:rFonts w:ascii="Times New Roman" w:hAnsi="Times New Roman"/>
-          <w:sz w:val="24"/>
-          <w:szCs w:val="24"/>
-          <w:lang w:val="en-IN"/>
-        </w:rPr>
-      </w:pPr>
-      <w:proofErr w:type="spellStart"/>
-      <w:r>
-        <w:rPr>
-          <w:rFonts w:ascii="Times New Roman" w:hAnsi="Times New Roman"/>
-          <w:sz w:val="24"/>
-          <w:szCs w:val="24"/>
-          <w:lang w:val="en-IN"/>
-        </w:rPr>
-        <w:t>elif</w:t>
-      </w:r>
-      <w:proofErr w:type="spellEnd"/>
-      <w:r>
-        <w:rPr>
-          <w:rFonts w:ascii="Times New Roman" w:hAnsi="Times New Roman"/>
-          <w:sz w:val="24"/>
-          <w:szCs w:val="24"/>
-          <w:lang w:val="en-IN"/>
-        </w:rPr>
-        <w:t xml:space="preserve"> [ $num2 -</w:t>
-      </w:r>
-      <w:proofErr w:type="spellStart"/>
-      <w:r>
-        <w:rPr>
-          <w:rFonts w:ascii="Times New Roman" w:hAnsi="Times New Roman"/>
-          <w:sz w:val="24"/>
-          <w:szCs w:val="24"/>
-          <w:lang w:val="en-IN"/>
-        </w:rPr>
-        <w:t>gt</w:t>
-      </w:r>
-      <w:proofErr w:type="spellEnd"/>
-      <w:r>
-        <w:rPr>
-          <w:rFonts w:ascii="Times New Roman" w:hAnsi="Times New Roman"/>
-          <w:sz w:val="24"/>
-          <w:szCs w:val="24"/>
-          <w:lang w:val="en-IN"/>
-        </w:rPr>
-        <w:t xml:space="preserve"> $num</w:t>
-      </w:r>
-      <w:proofErr w:type="gramStart"/>
-      <w:r>
-        <w:rPr>
-          <w:rFonts w:ascii="Times New Roman" w:hAnsi="Times New Roman"/>
-          <w:sz w:val="24"/>
-          <w:szCs w:val="24"/>
-          <w:lang w:val="en-IN"/>
-        </w:rPr>
-        <w:t>1 ]</w:t>
-      </w:r>
-      <w:proofErr w:type="gramEnd"/>
-      <w:r>
-        <w:rPr>
-          <w:rFonts w:ascii="Times New Roman" w:hAnsi="Times New Roman"/>
-          <w:sz w:val="24"/>
-          <w:szCs w:val="24"/>
-          <w:lang w:val="en-IN"/>
-        </w:rPr>
-        <w:t xml:space="preserve"> &amp;&amp; [ $num2 -</w:t>
-      </w:r>
-      <w:proofErr w:type="spellStart"/>
-      <w:r>
-        <w:rPr>
-          <w:rFonts w:ascii="Times New Roman" w:hAnsi="Times New Roman"/>
-          <w:sz w:val="24"/>
-          <w:szCs w:val="24"/>
-          <w:lang w:val="en-IN"/>
-        </w:rPr>
-        <w:t>gt</w:t>
-      </w:r>
-      <w:proofErr w:type="spellEnd"/>
-      <w:r>
-        <w:rPr>
-          <w:rFonts w:ascii="Times New Roman" w:hAnsi="Times New Roman"/>
-          <w:sz w:val="24"/>
-          <w:szCs w:val="24"/>
-          <w:lang w:val="en-IN"/>
-        </w:rPr>
-        <w:t xml:space="preserve"> $num3 ]; then</w:t>
-      </w:r>
-    </w:p>
-    <w:p>
-      <w:pPr>
-        <w:rPr>
-          <w:rFonts w:ascii="Times New Roman" w:hAnsi="Times New Roman"/>
-          <w:sz w:val="24"/>
-          <w:szCs w:val="24"/>
-          <w:lang w:val="en-IN"/>
-        </w:rPr>
-      </w:pPr>
-      <w:r>
-        <w:rPr>
-          <w:rFonts w:ascii="Times New Roman" w:hAnsi="Times New Roman"/>
-          <w:sz w:val="24"/>
-          <w:szCs w:val="24"/>
-          <w:lang w:val="en-IN"/>
-        </w:rPr>
-        <w:t xml:space="preserve">    echo "$num2 is Greater than $num1</w:t>
-      </w:r>
-      <w:r>
-        <w:rPr>
-          <w:rFonts w:ascii="Times New Roman" w:hAnsi="Times New Roman"/>
-          <w:sz w:val="24"/>
-          <w:szCs w:val="24"/>
-          <w:lang w:val="en-IN"/>
-        </w:rPr>
-        <w:t xml:space="preserve"> </w:t>
-      </w:r>
-      <w:r>
-        <w:rPr>
-          <w:rFonts w:ascii="Times New Roman" w:hAnsi="Times New Roman"/>
-          <w:sz w:val="24"/>
-          <w:szCs w:val="24"/>
-          <w:lang w:val="en-IN"/>
-        </w:rPr>
-        <w:t>&amp; $num3</w:t>
-      </w:r>
-      <w:r>
-        <w:rPr>
-          <w:rFonts w:ascii="Times New Roman" w:hAnsi="Times New Roman"/>
-          <w:sz w:val="24"/>
-          <w:szCs w:val="24"/>
-          <w:lang w:val="en-IN"/>
-        </w:rPr>
-        <w:t>"</w:t>
-      </w:r>
-    </w:p>
-    <w:p>
-      <w:pPr>
-        <w:rPr>
-          <w:rFonts w:ascii="Times New Roman" w:hAnsi="Times New Roman"/>
-          <w:sz w:val="24"/>
-          <w:szCs w:val="24"/>
-          <w:lang w:val="en-IN"/>
-        </w:rPr>
-      </w:pPr>
-      <w:r>
-        <w:rPr>
-          <w:rFonts w:ascii="Times New Roman" w:hAnsi="Times New Roman"/>
-          <w:sz w:val="24"/>
-          <w:szCs w:val="24"/>
-          <w:lang w:val="en-IN"/>
-        </w:rPr>
-        <w:t>else</w:t>
-      </w:r>
-    </w:p>
-    <w:p>
-      <w:pPr>
-        <w:rPr>
-          <w:rFonts w:ascii="Times New Roman" w:hAnsi="Times New Roman"/>
-          <w:sz w:val="24"/>
-          <w:szCs w:val="24"/>
-          <w:lang w:val="en-IN"/>
-        </w:rPr>
-      </w:pPr>
-      <w:r>
-        <w:rPr>
-          <w:rFonts w:ascii="Times New Roman" w:hAnsi="Times New Roman"/>
-          <w:sz w:val="24"/>
-          <w:szCs w:val="24"/>
-          <w:lang w:val="en-IN"/>
-        </w:rPr>
-        <w:t xml:space="preserve">    echo "$num3 is Greater than $num1</w:t>
-      </w:r>
-      <w:r>
-        <w:rPr>
-          <w:rFonts w:ascii="Times New Roman" w:hAnsi="Times New Roman"/>
-          <w:sz w:val="24"/>
-          <w:szCs w:val="24"/>
-          <w:lang w:val="en-IN"/>
-        </w:rPr>
-        <w:t xml:space="preserve"> </w:t>
-      </w:r>
-      <w:r>
-        <w:rPr>
-          <w:rFonts w:ascii="Times New Roman" w:hAnsi="Times New Roman"/>
-          <w:sz w:val="24"/>
-          <w:szCs w:val="24"/>
-          <w:lang w:val="en-IN"/>
-        </w:rPr>
-        <w:t>&amp; $num</w:t>
-      </w:r>
-      <w:r>
-        <w:rPr>
-          <w:rFonts w:ascii="Times New Roman" w:hAnsi="Times New Roman"/>
-          <w:sz w:val="24"/>
-          <w:szCs w:val="24"/>
-          <w:lang w:val="en-IN"/>
-        </w:rPr>
-        <w:t>2</w:t>
-      </w:r>
-      <w:r>
-        <w:rPr>
-          <w:rFonts w:ascii="Times New Roman" w:hAnsi="Times New Roman"/>
-          <w:sz w:val="24"/>
-          <w:szCs w:val="24"/>
-          <w:lang w:val="en-IN"/>
-        </w:rPr>
-        <w:t>"</w:t>
+        <w:t>echo "Enter Number1:"</w:t>
+      </w:r>
+    </w:p>
+    <w:p>
+      <w:pPr>
+        <w:rPr>
+          <w:rFonts w:ascii="Times New Roman" w:hAnsi="Times New Roman"/>
+          <w:sz w:val="24"/>
+          <w:szCs w:val="24"/>
+          <w:lang w:val="en-IN"/>
+        </w:rPr>
+      </w:pPr>
+      <w:r>
+        <w:rPr>
+          <w:rFonts w:ascii="Times New Roman" w:hAnsi="Times New Roman"/>
+          <w:sz w:val="24"/>
+          <w:szCs w:val="24"/>
+          <w:lang w:val="en-IN"/>
+        </w:rPr>
+        <w:t>read a</w:t>
+      </w:r>
+    </w:p>
+    <w:p>
+      <w:pPr>
+        <w:rPr>
+          <w:rFonts w:ascii="Times New Roman" w:hAnsi="Times New Roman"/>
+          <w:sz w:val="24"/>
+          <w:szCs w:val="24"/>
+          <w:lang w:val="en-IN"/>
+        </w:rPr>
+      </w:pPr>
+      <w:r>
+        <w:rPr>
+          <w:rFonts w:ascii="Times New Roman" w:hAnsi="Times New Roman"/>
+          <w:sz w:val="24"/>
+          <w:szCs w:val="24"/>
+          <w:lang w:val="en-IN"/>
+        </w:rPr>
+        <w:t>echo "Enter Number2:"</w:t>
+      </w:r>
+    </w:p>
+    <w:p>
+      <w:pPr>
+        <w:rPr>
+          <w:rFonts w:ascii="Times New Roman" w:hAnsi="Times New Roman"/>
+          <w:sz w:val="24"/>
+          <w:szCs w:val="24"/>
+          <w:lang w:val="en-IN"/>
+        </w:rPr>
+      </w:pPr>
+      <w:r>
+        <w:rPr>
+          <w:rFonts w:ascii="Times New Roman" w:hAnsi="Times New Roman"/>
+          <w:sz w:val="24"/>
+          <w:szCs w:val="24"/>
+          <w:lang w:val="en-IN"/>
+        </w:rPr>
+        <w:t>read b</w:t>
+      </w:r>
+    </w:p>
+    <w:p>
+      <w:pPr>
+        <w:rPr>
+          <w:rFonts w:ascii="Times New Roman" w:hAnsi="Times New Roman"/>
+          <w:sz w:val="24"/>
+          <w:szCs w:val="24"/>
+          <w:lang w:val="en-IN"/>
+        </w:rPr>
+      </w:pPr>
+      <w:r>
+        <w:rPr>
+          <w:rFonts w:ascii="Times New Roman" w:hAnsi="Times New Roman"/>
+          <w:sz w:val="24"/>
+          <w:szCs w:val="24"/>
+          <w:lang w:val="en-IN"/>
+        </w:rPr>
+        <w:t>echo "Enter Number3:"</w:t>
+      </w:r>
+    </w:p>
+    <w:p>
+      <w:pPr>
+        <w:rPr>
+          <w:rFonts w:ascii="Times New Roman" w:hAnsi="Times New Roman"/>
+          <w:sz w:val="24"/>
+          <w:szCs w:val="24"/>
+          <w:lang w:val="en-IN"/>
+        </w:rPr>
+      </w:pPr>
+      <w:r>
+        <w:rPr>
+          <w:rFonts w:ascii="Times New Roman" w:hAnsi="Times New Roman"/>
+          <w:sz w:val="24"/>
+          <w:szCs w:val="24"/>
+          <w:lang w:val="en-IN"/>
+        </w:rPr>
+        <w:t>read c</w:t>
+      </w:r>
+    </w:p>
+    <w:p>
+      <w:pPr>
+        <w:rPr>
+          <w:rFonts w:ascii="Times New Roman" w:hAnsi="Times New Roman"/>
+          <w:sz w:val="24"/>
+          <w:szCs w:val="24"/>
+          <w:lang w:val="en-IN"/>
+        </w:rPr>
+      </w:pPr>
+    </w:p>
+    <w:p>
+      <w:pPr>
+        <w:rPr>
+          <w:rFonts w:ascii="Times New Roman" w:hAnsi="Times New Roman"/>
+          <w:sz w:val="24"/>
+          <w:szCs w:val="24"/>
+          <w:lang w:val="en-IN"/>
+        </w:rPr>
+      </w:pPr>
+      <w:r>
+        <w:rPr>
+          <w:rFonts w:ascii="Times New Roman" w:hAnsi="Times New Roman"/>
+          <w:sz w:val="24"/>
+          <w:szCs w:val="24"/>
+          <w:lang w:val="en-IN"/>
+        </w:rPr>
+        <w:t>if [ $a -gt $b ] &amp;&amp; [ $a -gt $c ]</w:t>
+      </w:r>
+    </w:p>
+    <w:p>
+      <w:pPr>
+        <w:rPr>
+          <w:rFonts w:ascii="Times New Roman" w:hAnsi="Times New Roman"/>
+          <w:sz w:val="24"/>
+          <w:szCs w:val="24"/>
+          <w:lang w:val="en-IN"/>
+        </w:rPr>
+      </w:pPr>
+      <w:r>
+        <w:rPr>
+          <w:rFonts w:ascii="Times New Roman" w:hAnsi="Times New Roman"/>
+          <w:sz w:val="24"/>
+          <w:szCs w:val="24"/>
+          <w:lang w:val="en-IN"/>
+        </w:rPr>
+        <w:t>then</w:t>
+      </w:r>
+    </w:p>
+    <w:p>
+      <w:pPr>
+        <w:rPr>
+          <w:rFonts w:ascii="Times New Roman" w:hAnsi="Times New Roman"/>
+          <w:sz w:val="24"/>
+          <w:szCs w:val="24"/>
+          <w:lang w:val="en-IN"/>
+        </w:rPr>
+      </w:pPr>
+      <w:r>
+        <w:rPr>
+          <w:rFonts w:ascii="Times New Roman" w:hAnsi="Times New Roman"/>
+          <w:sz w:val="24"/>
+          <w:szCs w:val="24"/>
+          <w:lang w:val="en-IN"/>
+        </w:rPr>
+        <w:t xml:space="preserve">    echo "$a is greatest"</w:t>
+      </w:r>
+    </w:p>
+    <w:p>
+      <w:pPr>
+        <w:rPr>
+          <w:rFonts w:ascii="Times New Roman" w:hAnsi="Times New Roman"/>
+          <w:sz w:val="24"/>
+          <w:szCs w:val="24"/>
+          <w:lang w:val="en-IN"/>
+        </w:rPr>
+      </w:pPr>
+      <w:r>
+        <w:rPr>
+          <w:rFonts w:ascii="Times New Roman" w:hAnsi="Times New Roman"/>
+          <w:sz w:val="24"/>
+          <w:szCs w:val="24"/>
+          <w:lang w:val="en-IN"/>
+        </w:rPr>
+        <w:t>elif [ $b -gt $a ] &amp;&amp; [ $b -gt $c ]</w:t>
+      </w:r>
+    </w:p>
+    <w:p>
+      <w:pPr>
+        <w:rPr>
+          <w:rFonts w:ascii="Times New Roman" w:hAnsi="Times New Roman"/>
+          <w:sz w:val="24"/>
+          <w:szCs w:val="24"/>
+          <w:lang w:val="en-IN"/>
+        </w:rPr>
+      </w:pPr>
+      <w:r>
+        <w:rPr>
+          <w:rFonts w:ascii="Times New Roman" w:hAnsi="Times New Roman"/>
+          <w:sz w:val="24"/>
+          <w:szCs w:val="24"/>
+          <w:lang w:val="en-IN"/>
+        </w:rPr>
+        <w:t>then</w:t>
+      </w:r>
+    </w:p>
+    <w:p>
+      <w:pPr>
+        <w:rPr>
+          <w:rFonts w:ascii="Times New Roman" w:hAnsi="Times New Roman"/>
+          <w:sz w:val="24"/>
+          <w:szCs w:val="24"/>
+          <w:lang w:val="en-IN"/>
+        </w:rPr>
+      </w:pPr>
+      <w:r>
+        <w:rPr>
+          <w:rFonts w:ascii="Times New Roman" w:hAnsi="Times New Roman"/>
+          <w:sz w:val="24"/>
+          <w:szCs w:val="24"/>
+          <w:lang w:val="en-IN"/>
+        </w:rPr>
+        <w:t xml:space="preserve">    echo "$b is greatest"</w:t>
+      </w:r>
+    </w:p>
+    <w:p>
+      <w:pPr>
+        <w:rPr>
+          <w:rFonts w:ascii="Times New Roman" w:hAnsi="Times New Roman"/>
+          <w:sz w:val="24"/>
+          <w:szCs w:val="24"/>
+          <w:lang w:val="en-IN"/>
+        </w:rPr>
+      </w:pPr>
+      <w:r>
+        <w:rPr>
+          <w:rFonts w:ascii="Times New Roman" w:hAnsi="Times New Roman"/>
+          <w:sz w:val="24"/>
+          <w:szCs w:val="24"/>
+          <w:lang w:val="en-IN"/>
+        </w:rPr>
+        <w:t>elif [ $c -gt $a ] &amp;&amp; [ $c -gt $b ]</w:t>
+      </w:r>
+    </w:p>
+    <w:p>
+      <w:pPr>
+        <w:rPr>
+          <w:rFonts w:ascii="Times New Roman" w:hAnsi="Times New Roman"/>
+          <w:sz w:val="24"/>
+          <w:szCs w:val="24"/>
+          <w:lang w:val="en-IN"/>
+        </w:rPr>
+      </w:pPr>
+      <w:r>
+        <w:rPr>
+          <w:rFonts w:ascii="Times New Roman" w:hAnsi="Times New Roman"/>
+          <w:sz w:val="24"/>
+          <w:szCs w:val="24"/>
+          <w:lang w:val="en-IN"/>
+        </w:rPr>
+        <w:t>then</w:t>
+      </w:r>
+    </w:p>
+    <w:p>
+      <w:pPr>
+        <w:rPr>
+          <w:rFonts w:ascii="Times New Roman" w:hAnsi="Times New Roman"/>
+          <w:sz w:val="24"/>
+          <w:szCs w:val="24"/>
+          <w:lang w:val="en-IN"/>
+        </w:rPr>
+      </w:pPr>
+      <w:r>
+        <w:rPr>
+          <w:rFonts w:ascii="Times New Roman" w:hAnsi="Times New Roman"/>
+          <w:sz w:val="24"/>
+          <w:szCs w:val="24"/>
+          <w:lang w:val="en-IN"/>
+        </w:rPr>
+        <w:t xml:space="preserve">    echo "$c is greatest"</w:t>
+      </w:r>
+    </w:p>
+    <w:p>
+      <w:pPr>
+        <w:rPr>
+          <w:rFonts w:ascii="Times New Roman" w:hAnsi="Times New Roman"/>
+          <w:sz w:val="24"/>
+          <w:szCs w:val="24"/>
+          <w:lang w:val="en-IN"/>
+        </w:rPr>
+      </w:pPr>
+    </w:p>
+    <w:p>
+      <w:pPr>
+        <w:rPr>
+          <w:rFonts w:ascii="Times New Roman" w:hAnsi="Times New Roman"/>
+          <w:sz w:val="24"/>
+          <w:szCs w:val="24"/>
+          <w:lang w:val="en-IN"/>
+        </w:rPr>
+      </w:pPr>
+      <w:r>
+        <w:rPr>
+          <w:rFonts w:ascii="Times New Roman" w:hAnsi="Times New Roman"/>
+          <w:sz w:val="24"/>
+          <w:szCs w:val="24"/>
+          <w:lang w:val="en-IN"/>
+        </w:rPr>
+        <w:t>elif [ $a -eq $b ] &amp;&amp; [ $a -gt $c ]</w:t>
+      </w:r>
+    </w:p>
+    <w:p>
+      <w:pPr>
+        <w:rPr>
+          <w:rFonts w:ascii="Times New Roman" w:hAnsi="Times New Roman"/>
+          <w:sz w:val="24"/>
+          <w:szCs w:val="24"/>
+          <w:lang w:val="en-IN"/>
+        </w:rPr>
+      </w:pPr>
+      <w:r>
+        <w:rPr>
+          <w:rFonts w:ascii="Times New Roman" w:hAnsi="Times New Roman"/>
+          <w:sz w:val="24"/>
+          <w:szCs w:val="24"/>
+          <w:lang w:val="en-IN"/>
+        </w:rPr>
+        <w:lastRenderedPageBreak/>
+        <w:t>then</w:t>
+      </w:r>
+    </w:p>
+    <w:p>
+      <w:pPr>
+        <w:rPr>
+          <w:rFonts w:ascii="Times New Roman" w:hAnsi="Times New Roman"/>
+          <w:sz w:val="24"/>
+          <w:szCs w:val="24"/>
+          <w:lang w:val="en-IN"/>
+        </w:rPr>
+      </w:pPr>
+      <w:r>
+        <w:rPr>
+          <w:rFonts w:ascii="Times New Roman" w:hAnsi="Times New Roman"/>
+          <w:sz w:val="24"/>
+          <w:szCs w:val="24"/>
+          <w:lang w:val="en-IN"/>
+        </w:rPr>
+        <w:t xml:space="preserve">    echo "$a and $b are equal and greatest"</w:t>
+      </w:r>
+    </w:p>
+    <w:p>
+      <w:pPr>
+        <w:rPr>
+          <w:rFonts w:ascii="Times New Roman" w:hAnsi="Times New Roman"/>
+          <w:sz w:val="24"/>
+          <w:szCs w:val="24"/>
+          <w:lang w:val="en-IN"/>
+        </w:rPr>
+      </w:pPr>
+      <w:r>
+        <w:rPr>
+          <w:rFonts w:ascii="Times New Roman" w:hAnsi="Times New Roman"/>
+          <w:sz w:val="24"/>
+          <w:szCs w:val="24"/>
+          <w:lang w:val="en-IN"/>
+        </w:rPr>
+        <w:t>elif [ $a -eq $c ] &amp;&amp; [ $a -gt $b ]</w:t>
+      </w:r>
+    </w:p>
+    <w:p>
+      <w:pPr>
+        <w:rPr>
+          <w:rFonts w:ascii="Times New Roman" w:hAnsi="Times New Roman"/>
+          <w:sz w:val="24"/>
+          <w:szCs w:val="24"/>
+          <w:lang w:val="en-IN"/>
+        </w:rPr>
+      </w:pPr>
+      <w:r>
+        <w:rPr>
+          <w:rFonts w:ascii="Times New Roman" w:hAnsi="Times New Roman"/>
+          <w:sz w:val="24"/>
+          <w:szCs w:val="24"/>
+          <w:lang w:val="en-IN"/>
+        </w:rPr>
+        <w:t>then</w:t>
+      </w:r>
+    </w:p>
+    <w:p>
+      <w:pPr>
+        <w:rPr>
+          <w:rFonts w:ascii="Times New Roman" w:hAnsi="Times New Roman"/>
+          <w:sz w:val="24"/>
+          <w:szCs w:val="24"/>
+          <w:lang w:val="en-IN"/>
+        </w:rPr>
+      </w:pPr>
+      <w:r>
+        <w:rPr>
+          <w:rFonts w:ascii="Times New Roman" w:hAnsi="Times New Roman"/>
+          <w:sz w:val="24"/>
+          <w:szCs w:val="24"/>
+          <w:lang w:val="en-IN"/>
+        </w:rPr>
+        <w:t xml:space="preserve">    echo "$a and $c are equal and greatest"</w:t>
+      </w:r>
+    </w:p>
+    <w:p>
+      <w:pPr>
+        <w:rPr>
+          <w:rFonts w:ascii="Times New Roman" w:hAnsi="Times New Roman"/>
+          <w:sz w:val="24"/>
+          <w:szCs w:val="24"/>
+          <w:lang w:val="en-IN"/>
+        </w:rPr>
+      </w:pPr>
+      <w:r>
+        <w:rPr>
+          <w:rFonts w:ascii="Times New Roman" w:hAnsi="Times New Roman"/>
+          <w:sz w:val="24"/>
+          <w:szCs w:val="24"/>
+          <w:lang w:val="en-IN"/>
+        </w:rPr>
+        <w:t>elif [ $b -eq $c ] &amp;&amp; [ $b -gt $a ]</w:t>
+      </w:r>
+    </w:p>
+    <w:p>
+      <w:pPr>
+        <w:rPr>
+          <w:rFonts w:ascii="Times New Roman" w:hAnsi="Times New Roman"/>
+          <w:sz w:val="24"/>
+          <w:szCs w:val="24"/>
+          <w:lang w:val="en-IN"/>
+        </w:rPr>
+      </w:pPr>
+      <w:r>
+        <w:rPr>
+          <w:rFonts w:ascii="Times New Roman" w:hAnsi="Times New Roman"/>
+          <w:sz w:val="24"/>
+          <w:szCs w:val="24"/>
+          <w:lang w:val="en-IN"/>
+        </w:rPr>
+        <w:t>then</w:t>
+      </w:r>
+    </w:p>
+    <w:p>
+      <w:pPr>
+        <w:rPr>
+          <w:rFonts w:ascii="Times New Roman" w:hAnsi="Times New Roman"/>
+          <w:sz w:val="24"/>
+          <w:szCs w:val="24"/>
+          <w:lang w:val="en-IN"/>
+        </w:rPr>
+      </w:pPr>
+      <w:r>
+        <w:rPr>
+          <w:rFonts w:ascii="Times New Roman" w:hAnsi="Times New Roman"/>
+          <w:sz w:val="24"/>
+          <w:szCs w:val="24"/>
+          <w:lang w:val="en-IN"/>
+        </w:rPr>
+        <w:t xml:space="preserve">    echo "$b and $c are equal and greatest"</w:t>
+      </w:r>
+    </w:p>
+    <w:p>
+      <w:pPr>
+        <w:rPr>
+          <w:rFonts w:ascii="Times New Roman" w:hAnsi="Times New Roman"/>
+          <w:sz w:val="24"/>
+          <w:szCs w:val="24"/>
+          <w:lang w:val="en-IN"/>
+        </w:rPr>
+      </w:pPr>
+    </w:p>
+    <w:p>
+      <w:pPr>
+        <w:rPr>
+          <w:rFonts w:ascii="Times New Roman" w:hAnsi="Times New Roman"/>
+          <w:sz w:val="24"/>
+          <w:szCs w:val="24"/>
+          <w:lang w:val="en-IN"/>
+        </w:rPr>
+      </w:pPr>
+      <w:r>
+        <w:rPr>
+          <w:rFonts w:ascii="Times New Roman" w:hAnsi="Times New Roman"/>
+          <w:sz w:val="24"/>
+          <w:szCs w:val="24"/>
+          <w:lang w:val="en-IN"/>
+        </w:rPr>
+        <w:t>elif [ $a -eq $b ] &amp;&amp; [ $b -eq $c ]</w:t>
+      </w:r>
+    </w:p>
+    <w:p>
+      <w:pPr>
+        <w:rPr>
+          <w:rFonts w:ascii="Times New Roman" w:hAnsi="Times New Roman"/>
+          <w:sz w:val="24"/>
+          <w:szCs w:val="24"/>
+          <w:lang w:val="en-IN"/>
+        </w:rPr>
+      </w:pPr>
+      <w:r>
+        <w:rPr>
+          <w:rFonts w:ascii="Times New Roman" w:hAnsi="Times New Roman"/>
+          <w:sz w:val="24"/>
+          <w:szCs w:val="24"/>
+          <w:lang w:val="en-IN"/>
+        </w:rPr>
+        <w:t>then</w:t>
+      </w:r>
+    </w:p>
+    <w:p>
+      <w:pPr>
+        <w:rPr>
+          <w:rFonts w:ascii="Times New Roman" w:hAnsi="Times New Roman"/>
+          <w:sz w:val="24"/>
+          <w:szCs w:val="24"/>
+          <w:lang w:val="en-IN"/>
+        </w:rPr>
+      </w:pPr>
+      <w:r>
+        <w:rPr>
+          <w:rFonts w:ascii="Times New Roman" w:hAnsi="Times New Roman"/>
+          <w:sz w:val="24"/>
+          <w:szCs w:val="24"/>
+          <w:lang w:val="en-IN"/>
+        </w:rPr>
+        <w:t xml:space="preserve">    echo "All three numbers are equal"</w:t>
       </w:r>
     </w:p>
     <w:p>
@@ -9946,14 +9250,13 @@
       <w:r>
         <w:rPr>
           <w:rFonts w:ascii="Times New Roman" w:hAnsi="Times New Roman"/>
-          <w:noProof/>
           <w:lang w:val="en-IN"/>
         </w:rPr>
         <w:drawing>
-          <wp:inline distT="0" distB="0" distL="0" distR="0" wp14:anchorId="08440759" wp14:editId="40B8CBC9">
-            <wp:extent cx="5943600" cy="1009650"/>
+          <wp:inline distT="0" distB="0" distL="0" distR="0" wp14:anchorId="594F63A3" wp14:editId="55AE44CC">
+            <wp:extent cx="5468113" cy="1486107"/>
             <wp:effectExtent l="0" t="0" r="0" b="0"/>
-            <wp:docPr id="11" name="Picture 11"/>
+            <wp:docPr id="12" name="Picture 12"/>
             <wp:cNvGraphicFramePr>
               <a:graphicFrameLocks xmlns:a="http://schemas.openxmlformats.org/drawingml/2006/main" noChangeAspect="1"/>
             </wp:cNvGraphicFramePr>
@@ -9964,27 +9267,20 @@
                     <pic:cNvPr id="1" name=""/>
                     <pic:cNvPicPr/>
                   </pic:nvPicPr>
-                  <pic:blipFill rotWithShape="1">
+                  <pic:blipFill>
                     <a:blip r:embed="rId22"/>
-                    <a:srcRect b="1487"/>
-                    <a:stretch/>
+                    <a:stretch>
+                      <a:fillRect/>
+                    </a:stretch>
                   </pic:blipFill>
-                  <pic:spPr bwMode="auto">
+                  <pic:spPr>
                     <a:xfrm>
                       <a:off x="0" y="0"/>
-                      <a:ext cx="5943600" cy="1009650"/>
+                      <a:ext cx="5468113" cy="1486107"/>
                     </a:xfrm>
                     <a:prstGeom prst="rect">
                       <a:avLst/>
                     </a:prstGeom>
-                    <a:ln>
-                      <a:noFill/>
-                    </a:ln>
-                    <a:extLst>
-                      <a:ext uri="{53640926-AAD7-44D8-BBD7-CCE9431645EC}">
-                        <a14:shadowObscured xmlns:a14="http://schemas.microsoft.com/office/drawing/2010/main"/>
-                      </a:ext>
-                    </a:extLst>
                   </pic:spPr>
                 </pic:pic>
               </a:graphicData>
@@ -10049,23 +9345,13 @@
         <w:lang w:val="en-IN"/>
       </w:rPr>
     </w:pPr>
-    <w:proofErr w:type="spellStart"/>
     <w:r>
       <w:rPr>
         <w:rFonts w:ascii="Cambria" w:hAnsi="Cambria"/>
         <w:b/>
         <w:lang w:val="en-IN"/>
       </w:rPr>
-      <w:t>Enrollment</w:t>
-    </w:r>
-    <w:proofErr w:type="spellEnd"/>
-    <w:r>
-      <w:rPr>
-        <w:rFonts w:ascii="Cambria" w:hAnsi="Cambria"/>
-        <w:b/>
-        <w:lang w:val="en-IN"/>
-      </w:rPr>
-      <w:t xml:space="preserve"> No: </w:t>
+      <w:t xml:space="preserve">Enrollment No: </w:t>
     </w:r>
     <w:r>
       <w:rPr>

</xml_diff>